<commit_message>
Publicar el programa detallado y corregir los --- que rompían Quarto.
Co-authored-by: Cursor <cursoragent@cursor.com>
</commit_message>
<xml_diff>
--- a/Programa-IntroBioinfo-2026.docx
+++ b/Programa-IntroBioinfo-2026.docx
@@ -1686,7 +1686,7 @@
                 <w:sz w:val="19"/>
                 <w:szCs w:val="19"/>
               </w:rPr>
-              <w:t xml:space="preserve">Recuperar secuencias y genomas de NCBI, Ensembl y otras bases, verificando su integridad</w:t>
+              <w:t xml:space="preserve">Recuperar secuencias y genomas de NCBI, UniProt y otras bases, verificando su integridad</w:t>
             </w:r>
           </w:p>
         </w:tc>
@@ -2799,7 +2799,7 @@
           <w:sz w:val="21"/>
           <w:szCs w:val="21"/>
         </w:rPr>
-        <w:t xml:space="preserve">Cada unidad utiliza datos y casos provenientes de investigación real (genomas completos, archivos GFF y FASTA, registros de NCBI y Ensembl). El estudiante no aprende comandos en abstracto, sino como instrumentos para responder preguntas biológicas concretas.</w:t>
+        <w:t xml:space="preserve">Cada unidad utiliza datos y casos provenientes de investigación real (genomas completos, archivos GFF y FASTA, registros de NCBI y UniProt). El estudiante no aprende comandos en abstracto, sino como instrumentos para responder preguntas biológicas concretas.</w:t>
       </w:r>
     </w:p>
     <w:p>
@@ -3713,7 +3713,7 @@
           <w:sz w:val="21"/>
           <w:szCs w:val="21"/>
         </w:rPr>
-        <w:t xml:space="preserve">NCBI (Genomes, Nucleotide, PubMed), EMBL/DDBJ; Ensembl y BioMart.</w:t>
+        <w:t xml:space="preserve">NCBI (Genomes, Nucleotide, PubMed), EMBL/DDBJ; UniProt como fuente independiente para el contraste de inventarios.</w:t>
       </w:r>
     </w:p>
     <w:p>
@@ -5575,7 +5575,7 @@
                 <w:sz w:val="19"/>
                 <w:szCs w:val="19"/>
               </w:rPr>
-              <w:t xml:space="preserve">U4. Ensembl/BioMart y formateo con awk</w:t>
+              <w:t xml:space="preserve">U4. Contraste con fuente independiente (UniProt) y formateo con awk</w:t>
             </w:r>
           </w:p>
         </w:tc>
@@ -7188,7 +7188,7 @@
           <w:sz w:val="21"/>
           <w:szCs w:val="21"/>
         </w:rPr>
-        <w:t xml:space="preserve">Documentación oficial de Unix/Linux, NCBI, Ensembl/BioMart y BLAST.</w:t>
+        <w:t xml:space="preserve">Documentación oficial de Unix/Linux, NCBI, UniProt y BLAST.</w:t>
       </w:r>
     </w:p>
     <w:p>

</xml_diff>